<commit_message>
Agregado punto 3 (A validar)
</commit_message>
<xml_diff>
--- a/Errores detectados.docx
+++ b/Errores detectados.docx
@@ -12,7 +12,7 @@
     </w:p>
     <w:p>
       <w:r>
-        <w:t>TP Calidad de Software – Clínica. Resultado de ejecutar las suites de prueba: 63 tests, 57 pasan, 1 falla y 5 dan error. El código fuente no fue modificado.</w:t>
+        <w:t>TP Calidad de Software – Clínica. Resultado de ejecutar las suites de prueba de los tres puntos de la consigna: 106 tests, 97 pasan, 4 fallan y 5 dan error. El código fuente no fue modificado.</w:t>
       </w:r>
     </w:p>
     <w:p>
@@ -81,6 +81,23 @@
       <w:tr>
         <w:tc>
           <w:tcPr>
+            <w:tcW w:type="dxa" w:w="8640"/>
+            <w:gridSpan w:val="3"/>
+          </w:tcPr>
+          <w:p>
+            <w:r/>
+            <w:r>
+              <w:rPr>
+                <w:b/>
+              </w:rPr>
+              <w:t>Punto 1 – AsociadoDTO</w:t>
+            </w:r>
+          </w:p>
+        </w:tc>
+      </w:tr>
+      <w:tr>
+        <w:tc>
+          <w:tcPr>
             <w:tcW w:type="dxa" w:w="2880"/>
           </w:tcPr>
           <w:p>
@@ -106,6 +123,23 @@
           <w:p>
             <w:r>
               <w:t>setNumero exige numero &gt; 0 y el SRS pide numero &gt;= 0. El valor límite 0 es rechazado.</w:t>
+            </w:r>
+          </w:p>
+        </w:tc>
+      </w:tr>
+      <w:tr>
+        <w:tc>
+          <w:tcPr>
+            <w:tcW w:type="dxa" w:w="8640"/>
+            <w:gridSpan w:val="3"/>
+          </w:tcPr>
+          <w:p>
+            <w:r/>
+            <w:r>
+              <w:rPr>
+                <w:b/>
+              </w:rPr>
+              <w:t>Punto 2 – Integración con MySQL</w:t>
             </w:r>
           </w:p>
         </w:tc>
@@ -270,6 +304,119 @@
           </w:p>
         </w:tc>
       </w:tr>
+      <w:tr>
+        <w:tc>
+          <w:tcPr>
+            <w:tcW w:type="dxa" w:w="8640"/>
+            <w:gridSpan w:val="3"/>
+          </w:tcPr>
+          <w:p>
+            <w:r/>
+            <w:r>
+              <w:rPr>
+                <w:b/>
+              </w:rPr>
+              <w:t>Punto 3 – Ambulancia, State y RetornoAutomatico</w:t>
+            </w:r>
+          </w:p>
+        </w:tc>
+      </w:tr>
+      <w:tr>
+        <w:tc>
+          <w:tcPr>
+            <w:tcW w:type="dxa" w:w="2880"/>
+          </w:tcPr>
+          <w:p>
+            <w:r>
+              <w:t>TestAmbulanciaEstados.testTrasladando_Retorno</w:t>
+            </w:r>
+          </w:p>
+        </w:tc>
+        <w:tc>
+          <w:tcPr>
+            <w:tcW w:type="dxa" w:w="2880"/>
+          </w:tcPr>
+          <w:p>
+            <w:r>
+              <w:t>Falla: estado esperado DisponibleState, real RegresandoDelTallerState</w:t>
+            </w:r>
+          </w:p>
+        </w:tc>
+        <w:tc>
+          <w:tcPr>
+            <w:tcW w:type="dxa" w:w="2880"/>
+          </w:tcPr>
+          <w:p>
+            <w:r>
+              <w:t>TrasladandoPacienteClinicaState.RetornoClinica() pasa a RegresandoDelTallerState. El Javadoc de la clase dice que pasa a DisponibleState.</w:t>
+            </w:r>
+          </w:p>
+        </w:tc>
+      </w:tr>
+      <w:tr>
+        <w:tc>
+          <w:tcPr>
+            <w:tcW w:type="dxa" w:w="2880"/>
+          </w:tcPr>
+          <w:p>
+            <w:r>
+              <w:t>TestRetornoAutomatico.testSimulacionActiva_ElHiloSigueVivo</w:t>
+            </w:r>
+          </w:p>
+        </w:tc>
+        <w:tc>
+          <w:tcPr>
+            <w:tcW w:type="dxa" w:w="2880"/>
+          </w:tcPr>
+          <w:p>
+            <w:r>
+              <w:t>Falla: el hilo no sigue vivo</w:t>
+            </w:r>
+          </w:p>
+        </w:tc>
+        <w:tc>
+          <w:tcPr>
+            <w:tcW w:type="dxa" w:w="2880"/>
+          </w:tcPr>
+          <w:p>
+            <w:r>
+              <w:t>El bucle de RetornoAutomatico.run tiene la condición invertida (while (!isSimulacionActiva())): con la simulación activa el hilo termina al instante y nunca retorna la ambulancia.</w:t>
+            </w:r>
+          </w:p>
+        </w:tc>
+      </w:tr>
+      <w:tr>
+        <w:tc>
+          <w:tcPr>
+            <w:tcW w:type="dxa" w:w="2880"/>
+          </w:tcPr>
+          <w:p>
+            <w:r>
+              <w:t>TestRetornoAutomatico.testSimulacionFinalizada_ElHiloTermina</w:t>
+            </w:r>
+          </w:p>
+        </w:tc>
+        <w:tc>
+          <w:tcPr>
+            <w:tcW w:type="dxa" w:w="2880"/>
+          </w:tcPr>
+          <w:p>
+            <w:r>
+              <w:t>Falla: el hilo sigue vivo tras 1 s</w:t>
+            </w:r>
+          </w:p>
+        </w:tc>
+        <w:tc>
+          <w:tcPr>
+            <w:tcW w:type="dxa" w:w="2880"/>
+          </w:tcPr>
+          <w:p>
+            <w:r>
+              <w:t>Misma causa: con la simulación finalizada entra al bucle y duerme 10 s en vez de terminar.</w:t>
+            </w:r>
+          </w:p>
+        </w:tc>
+      </w:tr>
     </w:tbl>
     <w:p>
       <w:pPr>
@@ -317,8 +464,48 @@
       </w:r>
     </w:p>
     <w:p>
+      <w:pPr>
+        <w:pStyle w:val="ListBullet"/>
+      </w:pPr>
+      <w:r>
+        <w:t>TrasladandoPacienteClinicaState.RetornoClinica: pasa a RegresandoDelTallerState en lugar de DisponibleState (el Javadoc indica DisponibleState). Además captura la excepción y no hace nada.</w:t>
+      </w:r>
+    </w:p>
+    <w:p>
+      <w:pPr>
+        <w:pStyle w:val="ListBullet"/>
+      </w:pPr>
+      <w:r>
+        <w:t>RetornoAutomatico.run: condición del while invertida. El hilo de retorno automático nunca funciona como se describe en su Javadoc ("mientras la simulación esté activa").</w:t>
+      </w:r>
+    </w:p>
+    <w:p>
       <w:r>
         <w:t>Observados al revisar el código (ningún test falla por ellos):</w:t>
+      </w:r>
+    </w:p>
+    <w:p>
+      <w:pPr>
+        <w:pStyle w:val="ListBullet"/>
+      </w:pPr>
+      <w:r>
+        <w:t>TrasladandoPacienteClinicaState.RetornoClinica hace Thread.sleep(1000). Se invoca desde métodos synchronized de Ambulancia (retornoAutomatico, regresarSinPaciente), por lo que mantiene tomado el lock de la ambulancia 1 segundo y bloquea a los demás hilos.</w:t>
+      </w:r>
+    </w:p>
+    <w:p>
+      <w:pPr>
+        <w:pStyle w:val="ListBullet"/>
+      </w:pPr>
+      <w:r>
+        <w:t>Ambulancia.estadoActual no es volatile y getEstadoActual() no está sincronizado, mientras setState() sí lo está: otro hilo podría no ver el estado actualizado.</w:t>
+      </w:r>
+    </w:p>
+    <w:p>
+      <w:pPr>
+        <w:pStyle w:val="ListBullet"/>
+      </w:pPr>
+      <w:r>
+        <w:t>Ambulancia.retornoAutomatico llama al estado pero, a diferencia de regresarSinPaciente, no libera ocupado (a confirmar si es intencional).</w:t>
       </w:r>
     </w:p>
     <w:p>
@@ -390,7 +577,7 @@
         <w:pStyle w:val="ListBullet"/>
       </w:pPr>
       <w:r>
-        <w:t>El fixture reinicia el Singleton por reflexión (campo estático privado instancia) para devolver cada test a un estado limpio.</w:t>
+        <w:t>El fixture de base de datos reinicia el Singleton por reflexión (campo estático privado instancia) para devolver cada test a un estado limpio.</w:t>
       </w:r>
     </w:p>
     <w:p>
@@ -399,6 +586,22 @@
       </w:pPr>
       <w:r>
         <w:t>Las clases erróneas de la conexión (servidor caído, credenciales incorrectas) se prueban a mano cambiando las constantes de BaseDeDatos.</w:t>
+      </w:r>
+    </w:p>
+    <w:p>
+      <w:pPr>
+        <w:pStyle w:val="ListBullet"/>
+      </w:pPr>
+      <w:r>
+        <w:t>Los tests del punto 3 usan Mockito 3.2.4 (dependencia de scope test) para reemplazar State por un mock. Los tests con hilos tienen un límite de 15 segundos: un deadlock hace fallar el test en lugar de colgarlo.</w:t>
+      </w:r>
+    </w:p>
+    <w:p>
+      <w:pPr>
+        <w:pStyle w:val="ListBullet"/>
+      </w:pPr>
+      <w:r>
+        <w:t>testInterrupcion_TerminaLimpio (RetornoAutomatico) pasa aun con el defecto de la condición invertida, porque el hilo ya terminó solo; el defecto lo detectan los otros dos tests de esa clase.</w:t>
       </w:r>
     </w:p>
     <w:sectPr>

</xml_diff>

<commit_message>
se modifico el excel y se acomodaron los exception para que sean if. Se quito el assertion error
</commit_message>
<xml_diff>
--- a/Errores detectados.docx
+++ b/Errores detectados.docx
@@ -12,7 +12,7 @@
     </w:p>
     <w:p>
       <w:r>
-        <w:t>TP Calidad de Software – Clínica. Resultado de ejecutar las suites de prueba de los tres puntos de la consigna: 106 tests, 97 pasan, 4 fallan y 5 dan error. El código fuente no fue modificado.</w:t>
+        <w:t>TP Calidad de Software – Clínica. Resultado de ejecutar las suites de prueba de los tres puntos de la consigna: 90 tests, 80 pasan y 10 fallan. El código fuente no fue modificado.</w:t>
       </w:r>
     </w:p>
     <w:p>
@@ -161,7 +161,7 @@
           </w:tcPr>
           <w:p>
             <w:r>
-              <w:t>Error: Before start of result set</w:t>
+              <w:t>Falla: error de SQL inesperado (Before start of result set)</w:t>
             </w:r>
           </w:p>
         </w:tc>
@@ -193,7 +193,7 @@
           </w:tcPr>
           <w:p>
             <w:r>
-              <w:t>Error: Before start of result set</w:t>
+              <w:t>Falla: error de SQL inesperado (Before start of result set)</w:t>
             </w:r>
           </w:p>
         </w:tc>
@@ -225,7 +225,7 @@
           </w:tcPr>
           <w:p>
             <w:r>
-              <w:t>Error: Before start of result set</w:t>
+              <w:t>Falla: error de SQL inesperado (Before start of result set)</w:t>
             </w:r>
           </w:p>
         </w:tc>
@@ -257,7 +257,7 @@
           </w:tcPr>
           <w:p>
             <w:r>
-              <w:t>Error: Illegal operation on empty result set</w:t>
+              <w:t>Falla: error de SQL inesperado (Illegal operation on empty result set)</w:t>
             </w:r>
           </w:p>
         </w:tc>
@@ -289,7 +289,7 @@
           </w:tcPr>
           <w:p>
             <w:r>
-              <w:t>Error: Duplicate entry 87654321</w:t>
+              <w:t>Falla: error de SQL inesperado (Duplicate entry 87654321)</w:t>
             </w:r>
           </w:p>
         </w:tc>
@@ -300,6 +300,38 @@
           <w:p>
             <w:r>
               <w:t>El UPDATE siempre modifica el asociado con id 1.</w:t>
+            </w:r>
+          </w:p>
+        </w:tc>
+      </w:tr>
+      <w:tr>
+        <w:tc>
+          <w:tcPr>
+            <w:tcW w:type="dxa" w:w="2880"/>
+          </w:tcPr>
+          <w:p>
+            <w:r>
+              <w:t>TestDaoActualizar.testActualizar_CambiaCalle</w:t>
+            </w:r>
+          </w:p>
+        </w:tc>
+        <w:tc>
+          <w:tcPr>
+            <w:tcW w:type="dxa" w:w="2880"/>
+          </w:tcPr>
+          <w:p>
+            <w:r>
+              <w:t>Falla: error de SQL inesperado (Duplicate entry 10112233)</w:t>
+            </w:r>
+          </w:p>
+        </w:tc>
+        <w:tc>
+          <w:tcPr>
+            <w:tcW w:type="dxa" w:w="2880"/>
+          </w:tcPr>
+          <w:p>
+            <w:r>
+              <w:t>El UPDATE escribe sobre el id 1 en vez del id 15; al poner el DNI 10112233 choca con la restricción UNIQUE.</w:t>
             </w:r>
           </w:p>
         </w:tc>
@@ -453,14 +485,6 @@
       </w:pPr>
       <w:r>
         <w:t>BaseDeDatos.ejecutarActualizacion: stmt.setInt(8, 1) deja fijo el WHERE id = 1. Cualquier actualizar() modifica siempre la fila con id 1. La causa de fondo es que Asociado y AsociadoDTO no guardan el id, así que no se sabe qué fila actualizar. Si el asociado tiene otro DNI, además puede chocar con la restricción UNIQUE.</w:t>
-      </w:r>
-    </w:p>
-    <w:p>
-      <w:pPr>
-        <w:pStyle w:val="ListBullet"/>
-      </w:pPr>
-      <w:r>
-        <w:t>Efecto oculto del anterior: testActualizar_CambiaCalle pasa solo porque el DNI 12345678 es justamente el del id 1.</w:t>
       </w:r>
     </w:p>
     <w:p>

</xml_diff>